<commit_message>
feat: multilíngue - detecção automática de idioma e tela de Perfil traduzida
</commit_message>
<xml_diff>
--- a/OKCHEFF_CONTINUIDADE_02_07_2026.docx
+++ b/OKCHEFF_CONTINUIDADE_02_07_2026.docx
@@ -292,6 +292,19 @@
       </w:pPr>
       <w:r>
         <w:t xml:space="preserve">Correção de segurança: chave da OpenAI parou de vazar no GitHub (.gitignore)</w:t>
+      </w:r>
+    </w:p>
+    <w:p>
+      <w:pPr>
+        <w:pStyle w:val="ListParagraph"/>
+        <w:numPr>
+          <w:ilvl w:val="0"/>
+          <w:numId w:val="1"/>
+        </w:numPr>
+        <w:spacing w:after="60"/>
+      </w:pPr>
+      <w:r>
+        <w:t xml:space="preserve">Botão de "Iniciar Preparo" (com trava da lista de compras) padronizado nas 3 abas — antes só existia na Inspiração</w:t>
       </w:r>
     </w:p>
     <w:p>

</xml_diff>